<commit_message>
personal library (ver-2) update-156
</commit_message>
<xml_diff>
--- a/resources/Courses/GPT/Courses.docx
+++ b/resources/Courses/GPT/Courses.docx
@@ -1450,7 +1450,7 @@
           </w:tcPr>
           <w:p>
             <w:r>
-              <w:t xml:space="preserve">Database Management System </w:t>
+              <w:t>Software Engineering: Reference-1</w:t>
             </w:r>
           </w:p>
         </w:tc>
@@ -1472,7 +1472,7 @@
           </w:tcPr>
           <w:p>
             <w:r>
-              <w:t>27</w:t>
+              <w:t>15</w:t>
             </w:r>
           </w:p>
         </w:tc>
@@ -1483,7 +1483,7 @@
           </w:tcPr>
           <w:p>
             <w:r>
-              <w:t>454 x 2</w:t>
+              <w:t>241</w:t>
             </w:r>
           </w:p>
         </w:tc>
@@ -1494,7 +1494,7 @@
           </w:tcPr>
           <w:p>
             <w:r>
-              <w:t>1373</w:t>
+              <w:t>712</w:t>
             </w:r>
           </w:p>
         </w:tc>
@@ -1505,7 +1505,7 @@
           </w:tcPr>
           <w:p>
             <w:r>
-              <w:t xml:space="preserve">M-4: 1300 / 20 Days = 65 Pages </w:t>
+              <w:t xml:space="preserve">M-5: 1600 / 20 Days = 80 Pages </w:t>
             </w:r>
           </w:p>
         </w:tc>
@@ -1516,14 +1516,7 @@
             <w:tcW w:w="192" w:type="pct"/>
             <w:shd w:val="clear" w:color="auto" w:fill="E7E6E6" w:themeFill="background2"/>
           </w:tcPr>
-          <w:p>
-            <w:r>
-              <w:t>0</w:t>
-            </w:r>
-            <w:r>
-              <w:t>3</w:t>
-            </w:r>
-          </w:p>
+          <w:p/>
         </w:tc>
         <w:tc>
           <w:tcPr>
@@ -1532,7 +1525,7 @@
           </w:tcPr>
           <w:p>
             <w:r>
-              <w:t>Software Engineering: Reference-1</w:t>
+              <w:t>Software Engineering: Reference-2</w:t>
             </w:r>
           </w:p>
         </w:tc>
@@ -1541,11 +1534,7 @@
             <w:tcW w:w="568" w:type="pct"/>
             <w:shd w:val="clear" w:color="auto" w:fill="E7E6E6" w:themeFill="background2"/>
           </w:tcPr>
-          <w:p>
-            <w:r>
-              <w:t>T-H3 + S-H4</w:t>
-            </w:r>
-          </w:p>
+          <w:p/>
         </w:tc>
         <w:tc>
           <w:tcPr>
@@ -1554,7 +1543,7 @@
           </w:tcPr>
           <w:p>
             <w:r>
-              <w:t>15</w:t>
+              <w:t>33</w:t>
             </w:r>
           </w:p>
         </w:tc>
@@ -1565,7 +1554,7 @@
           </w:tcPr>
           <w:p>
             <w:r>
-              <w:t>241</w:t>
+              <w:t>510</w:t>
             </w:r>
           </w:p>
         </w:tc>
@@ -1576,7 +1565,7 @@
           </w:tcPr>
           <w:p>
             <w:r>
-              <w:t>712</w:t>
+              <w:t>930</w:t>
             </w:r>
           </w:p>
         </w:tc>
@@ -1585,11 +1574,7 @@
             <w:tcW w:w="1060" w:type="pct"/>
             <w:shd w:val="clear" w:color="auto" w:fill="E7E6E6" w:themeFill="background2"/>
           </w:tcPr>
-          <w:p>
-            <w:r>
-              <w:t xml:space="preserve">M-5: 1600 / 20 Days = 80 Pages </w:t>
-            </w:r>
-          </w:p>
+          <w:p/>
         </w:tc>
       </w:tr>
       <w:tr>
@@ -1598,7 +1583,14 @@
             <w:tcW w:w="192" w:type="pct"/>
             <w:shd w:val="clear" w:color="auto" w:fill="E7E6E6" w:themeFill="background2"/>
           </w:tcPr>
-          <w:p/>
+          <w:p>
+            <w:r>
+              <w:t>0</w:t>
+            </w:r>
+            <w:r>
+              <w:t>3</w:t>
+            </w:r>
+          </w:p>
         </w:tc>
         <w:tc>
           <w:tcPr>
@@ -1607,7 +1599,7 @@
           </w:tcPr>
           <w:p>
             <w:r>
-              <w:t>Software Engineering: Reference-2</w:t>
+              <w:t xml:space="preserve">Database Management System </w:t>
             </w:r>
           </w:p>
         </w:tc>
@@ -1616,7 +1608,11 @@
             <w:tcW w:w="568" w:type="pct"/>
             <w:shd w:val="clear" w:color="auto" w:fill="E7E6E6" w:themeFill="background2"/>
           </w:tcPr>
-          <w:p/>
+          <w:p>
+            <w:r>
+              <w:t>T-H3 + S-H4</w:t>
+            </w:r>
+          </w:p>
         </w:tc>
         <w:tc>
           <w:tcPr>
@@ -1625,7 +1621,7 @@
           </w:tcPr>
           <w:p>
             <w:r>
-              <w:t>33</w:t>
+              <w:t>27</w:t>
             </w:r>
           </w:p>
         </w:tc>
@@ -1636,7 +1632,7 @@
           </w:tcPr>
           <w:p>
             <w:r>
-              <w:t>510</w:t>
+              <w:t>454 x 2</w:t>
             </w:r>
           </w:p>
         </w:tc>
@@ -1647,7 +1643,7 @@
           </w:tcPr>
           <w:p>
             <w:r>
-              <w:t>930</w:t>
+              <w:t>1373</w:t>
             </w:r>
           </w:p>
         </w:tc>
@@ -1656,7 +1652,11 @@
             <w:tcW w:w="1060" w:type="pct"/>
             <w:shd w:val="clear" w:color="auto" w:fill="E7E6E6" w:themeFill="background2"/>
           </w:tcPr>
-          <w:p/>
+          <w:p>
+            <w:r>
+              <w:t xml:space="preserve">M-4: 1300 / 20 Days = 65 Pages </w:t>
+            </w:r>
+          </w:p>
         </w:tc>
       </w:tr>
       <w:tr>
@@ -3592,16 +3592,7 @@
               <w:t>DevOps Tools</w:t>
             </w:r>
             <w:r>
-              <w:t xml:space="preserve">, </w:t>
-            </w:r>
-            <w:r>
-              <w:t>Linux</w:t>
-            </w:r>
-            <w:r>
-              <w:t xml:space="preserve"> and </w:t>
-            </w:r>
-            <w:r>
-              <w:t>Cloud Computing</w:t>
+              <w:t>, Linux and Cloud Computing</w:t>
             </w:r>
           </w:p>
         </w:tc>

</xml_diff>

<commit_message>
personal library (ver-2) update-158
</commit_message>
<xml_diff>
--- a/resources/Courses/GPT/Courses.docx
+++ b/resources/Courses/GPT/Courses.docx
@@ -135,7 +135,11 @@
               <w:t xml:space="preserve">3 Hours </w:t>
             </w:r>
             <w:r>
-              <w:t>(Evening)</w:t>
+              <w:t>(</w:t>
+            </w:r>
+            <w:proofErr w:type="gramStart"/>
+            <w:r>
+              <w:t>Evening)</w:t>
             </w:r>
             <w:r>
               <w:t xml:space="preserve"> </w:t>
@@ -144,7 +148,11 @@
               <w:t xml:space="preserve"> </w:t>
             </w:r>
             <w:r>
-              <w:t>= 15 Hours</w:t>
+              <w:t>=</w:t>
+            </w:r>
+            <w:proofErr w:type="gramEnd"/>
+            <w:r>
+              <w:t xml:space="preserve"> 15 Hours</w:t>
             </w:r>
           </w:p>
         </w:tc>
@@ -261,7 +269,15 @@
           </w:tcPr>
           <w:p>
             <w:r>
-              <w:t>5 Days x 6 Hours (Full Day)  = 30 Hours</w:t>
+              <w:t xml:space="preserve">5 Days x 6 Hours (Full </w:t>
+            </w:r>
+            <w:proofErr w:type="gramStart"/>
+            <w:r>
+              <w:t>Day)  =</w:t>
+            </w:r>
+            <w:proofErr w:type="gramEnd"/>
+            <w:r>
+              <w:t xml:space="preserve"> 30 Hours</w:t>
             </w:r>
           </w:p>
         </w:tc>
@@ -298,8 +314,17 @@
                 <w:b/>
                 <w:bCs/>
               </w:rPr>
-              <w:t>Review and Test</w:t>
-            </w:r>
+              <w:t xml:space="preserve">Review and </w:t>
+            </w:r>
+            <w:proofErr w:type="gramStart"/>
+            <w:r>
+              <w:rPr>
+                <w:b/>
+                <w:bCs/>
+              </w:rPr>
+              <w:t>Test</w:t>
+            </w:r>
+            <w:proofErr w:type="gramEnd"/>
           </w:p>
         </w:tc>
         <w:tc>
@@ -315,10 +340,18 @@
               <w:t xml:space="preserve"> </w:t>
             </w:r>
             <w:r>
-              <w:t xml:space="preserve">(Full Day)  </w:t>
-            </w:r>
-            <w:r>
-              <w:t xml:space="preserve">= </w:t>
+              <w:t xml:space="preserve">(Full </w:t>
+            </w:r>
+            <w:proofErr w:type="gramStart"/>
+            <w:r>
+              <w:t xml:space="preserve">Day)  </w:t>
+            </w:r>
+            <w:r>
+              <w:t>=</w:t>
+            </w:r>
+            <w:proofErr w:type="gramEnd"/>
+            <w:r>
+              <w:t xml:space="preserve"> </w:t>
             </w:r>
             <w:r>
               <w:t>0</w:t>
@@ -386,10 +419,18 @@
               <w:t xml:space="preserve"> </w:t>
             </w:r>
             <w:r>
-              <w:t xml:space="preserve">(Full Day)  </w:t>
-            </w:r>
-            <w:r>
-              <w:t xml:space="preserve">= </w:t>
+              <w:t xml:space="preserve">(Full </w:t>
+            </w:r>
+            <w:proofErr w:type="gramStart"/>
+            <w:r>
+              <w:t xml:space="preserve">Day)  </w:t>
+            </w:r>
+            <w:r>
+              <w:t>=</w:t>
+            </w:r>
+            <w:proofErr w:type="gramEnd"/>
+            <w:r>
+              <w:t xml:space="preserve"> </w:t>
             </w:r>
             <w:r>
               <w:t>0</w:t>
@@ -453,7 +494,15 @@
           </w:tcPr>
           <w:p>
             <w:r>
-              <w:t>2 Days x 6 Hours (Full Day)  = 12 Hours</w:t>
+              <w:t xml:space="preserve">2 Days x 6 Hours (Full </w:t>
+            </w:r>
+            <w:proofErr w:type="gramStart"/>
+            <w:r>
+              <w:t>Day)  =</w:t>
+            </w:r>
+            <w:proofErr w:type="gramEnd"/>
+            <w:r>
+              <w:t xml:space="preserve"> 12 Hours</w:t>
             </w:r>
           </w:p>
         </w:tc>
@@ -495,6 +544,7 @@
         </w:rPr>
         <w:t xml:space="preserve">Additional </w:t>
       </w:r>
+      <w:proofErr w:type="gramStart"/>
       <w:r>
         <w:rPr>
           <w:b/>
@@ -505,6 +555,7 @@
         </w:rPr>
         <w:t>Resources:-</w:t>
       </w:r>
+      <w:proofErr w:type="gramEnd"/>
     </w:p>
     <w:p>
       <w:pPr>
@@ -542,8 +593,13 @@
         <w:spacing w:after="0"/>
       </w:pPr>
       <w:r>
-        <w:t>Certification: MIT, Harvard, Oxford, Microsoft, Google, OpenAI, IBM, Etc</w:t>
-      </w:r>
+        <w:t xml:space="preserve">Certification: MIT, Harvard, Oxford, Microsoft, Google, OpenAI, IBM, </w:t>
+      </w:r>
+      <w:proofErr w:type="spellStart"/>
+      <w:r>
+        <w:t>Etc</w:t>
+      </w:r>
+      <w:proofErr w:type="spellEnd"/>
     </w:p>
     <w:p>
       <w:pPr>
@@ -565,8 +621,9 @@
           <w:szCs w:val="24"/>
           <w:u w:val="single"/>
         </w:rPr>
-        <w:t>Practice (5 Days of Evening Shift)</w:t>
-      </w:r>
+        <w:t>Practice (5 Days of Evening Shift</w:t>
+      </w:r>
+      <w:proofErr w:type="gramStart"/>
       <w:r>
         <w:rPr>
           <w:b/>
@@ -575,8 +632,19 @@
           <w:szCs w:val="24"/>
           <w:u w:val="single"/>
         </w:rPr>
+        <w:t>)</w:t>
+      </w:r>
+      <w:r>
+        <w:rPr>
+          <w:b/>
+          <w:bCs/>
+          <w:sz w:val="24"/>
+          <w:szCs w:val="24"/>
+          <w:u w:val="single"/>
+        </w:rPr>
         <w:t>:-</w:t>
       </w:r>
+      <w:proofErr w:type="gramEnd"/>
     </w:p>
     <w:p>
       <w:pPr>
@@ -662,8 +730,9 @@
           <w:szCs w:val="24"/>
           <w:u w:val="single"/>
         </w:rPr>
-        <w:t>(5 Days of Morning Shift)</w:t>
-      </w:r>
+        <w:t>(5 Days of Morning Shift</w:t>
+      </w:r>
+      <w:proofErr w:type="gramStart"/>
       <w:r>
         <w:rPr>
           <w:b/>
@@ -672,8 +741,19 @@
           <w:szCs w:val="24"/>
           <w:u w:val="single"/>
         </w:rPr>
+        <w:t>)</w:t>
+      </w:r>
+      <w:r>
+        <w:rPr>
+          <w:b/>
+          <w:bCs/>
+          <w:sz w:val="24"/>
+          <w:szCs w:val="24"/>
+          <w:u w:val="single"/>
+        </w:rPr>
         <w:t>:-</w:t>
       </w:r>
+      <w:proofErr w:type="gramEnd"/>
     </w:p>
     <w:p>
       <w:pPr>
@@ -722,8 +802,9 @@
           <w:szCs w:val="24"/>
           <w:u w:val="single"/>
         </w:rPr>
-        <w:t>(Off Days of Evening Shift)</w:t>
-      </w:r>
+        <w:t>(Off Days of Evening Shift</w:t>
+      </w:r>
+      <w:proofErr w:type="gramStart"/>
       <w:r>
         <w:rPr>
           <w:b/>
@@ -732,7 +813,28 @@
           <w:szCs w:val="24"/>
           <w:u w:val="single"/>
         </w:rPr>
-        <w:t xml:space="preserve">:- </w:t>
+        <w:t>)</w:t>
+      </w:r>
+      <w:r>
+        <w:rPr>
+          <w:b/>
+          <w:bCs/>
+          <w:sz w:val="24"/>
+          <w:szCs w:val="24"/>
+          <w:u w:val="single"/>
+        </w:rPr>
+        <w:t>:-</w:t>
+      </w:r>
+      <w:proofErr w:type="gramEnd"/>
+      <w:r>
+        <w:rPr>
+          <w:b/>
+          <w:bCs/>
+          <w:sz w:val="24"/>
+          <w:szCs w:val="24"/>
+          <w:u w:val="single"/>
+        </w:rPr>
+        <w:t xml:space="preserve"> </w:t>
       </w:r>
     </w:p>
     <w:p>
@@ -788,8 +890,9 @@
           <w:szCs w:val="24"/>
           <w:u w:val="single"/>
         </w:rPr>
-        <w:t>(Off Days of Morning Shift)</w:t>
-      </w:r>
+        <w:t>(Off Days of Morning Shift</w:t>
+      </w:r>
+      <w:proofErr w:type="gramStart"/>
       <w:r>
         <w:rPr>
           <w:b/>
@@ -798,8 +901,19 @@
           <w:szCs w:val="24"/>
           <w:u w:val="single"/>
         </w:rPr>
+        <w:t>)</w:t>
+      </w:r>
+      <w:r>
+        <w:rPr>
+          <w:b/>
+          <w:bCs/>
+          <w:sz w:val="24"/>
+          <w:szCs w:val="24"/>
+          <w:u w:val="single"/>
+        </w:rPr>
         <w:t>:-</w:t>
       </w:r>
+      <w:proofErr w:type="gramEnd"/>
     </w:p>
     <w:p>
       <w:pPr>
@@ -1585,10 +1699,7 @@
           </w:tcPr>
           <w:p>
             <w:r>
-              <w:t>0</w:t>
-            </w:r>
-            <w:r>
-              <w:t>3</w:t>
+              <w:t>03</w:t>
             </w:r>
           </w:p>
         </w:tc>
@@ -2170,7 +2281,7 @@
               <w:t>0</w:t>
             </w:r>
             <w:r>
-              <w:t>1</w:t>
+              <w:t>6</w:t>
             </w:r>
           </w:p>
         </w:tc>
@@ -2308,7 +2419,10 @@
           </w:tcPr>
           <w:p>
             <w:r>
-              <w:t>02</w:t>
+              <w:t>0</w:t>
+            </w:r>
+            <w:r>
+              <w:t>7</w:t>
             </w:r>
           </w:p>
         </w:tc>
@@ -2588,8 +2702,19 @@
           <w:color w:val="C00000"/>
           <w:sz w:val="28"/>
         </w:rPr>
-        <w:t>Course Outcomes:-</w:t>
-      </w:r>
+        <w:t xml:space="preserve">Course </w:t>
+      </w:r>
+      <w:proofErr w:type="gramStart"/>
+      <w:r>
+        <w:rPr>
+          <w:b/>
+          <w:bCs/>
+          <w:color w:val="C00000"/>
+          <w:sz w:val="28"/>
+        </w:rPr>
+        <w:t>Outcomes:-</w:t>
+      </w:r>
+      <w:proofErr w:type="gramEnd"/>
     </w:p>
     <w:p>
       <w:pPr>
@@ -3737,7 +3862,10 @@
           </w:tcPr>
           <w:p>
             <w:r>
-              <w:t>01</w:t>
+              <w:t>0</w:t>
+            </w:r>
+            <w:r>
+              <w:t>6</w:t>
             </w:r>
           </w:p>
         </w:tc>
@@ -3865,7 +3993,10 @@
           </w:tcPr>
           <w:p>
             <w:r>
-              <w:t>02</w:t>
+              <w:t>0</w:t>
+            </w:r>
+            <w:r>
+              <w:t>7</w:t>
             </w:r>
           </w:p>
         </w:tc>
@@ -4120,8 +4251,19 @@
           <w:color w:val="C00000"/>
           <w:sz w:val="28"/>
         </w:rPr>
-        <w:t>Course Outcomes:-</w:t>
-      </w:r>
+        <w:t xml:space="preserve">Course </w:t>
+      </w:r>
+      <w:proofErr w:type="gramStart"/>
+      <w:r>
+        <w:rPr>
+          <w:b/>
+          <w:bCs/>
+          <w:color w:val="C00000"/>
+          <w:sz w:val="28"/>
+        </w:rPr>
+        <w:t>Outcomes:-</w:t>
+      </w:r>
+      <w:proofErr w:type="gramEnd"/>
     </w:p>
     <w:p>
       <w:pPr>
@@ -5377,7 +5519,10 @@
           </w:tcPr>
           <w:p>
             <w:r>
-              <w:t>01</w:t>
+              <w:t>0</w:t>
+            </w:r>
+            <w:r>
+              <w:t>6</w:t>
             </w:r>
           </w:p>
         </w:tc>
@@ -5445,7 +5590,10 @@
           </w:tcPr>
           <w:p>
             <w:r>
-              <w:t>02</w:t>
+              <w:t>0</w:t>
+            </w:r>
+            <w:r>
+              <w:t>7</w:t>
             </w:r>
           </w:p>
         </w:tc>
@@ -5693,8 +5841,19 @@
           <w:color w:val="C00000"/>
           <w:sz w:val="28"/>
         </w:rPr>
-        <w:t>Course Outcomes:-</w:t>
-      </w:r>
+        <w:t xml:space="preserve">Course </w:t>
+      </w:r>
+      <w:proofErr w:type="gramStart"/>
+      <w:r>
+        <w:rPr>
+          <w:b/>
+          <w:bCs/>
+          <w:color w:val="C00000"/>
+          <w:sz w:val="28"/>
+        </w:rPr>
+        <w:t>Outcomes:-</w:t>
+      </w:r>
+      <w:proofErr w:type="gramEnd"/>
     </w:p>
     <w:p>
       <w:pPr>
@@ -6667,7 +6826,10 @@
           </w:tcPr>
           <w:p>
             <w:r>
-              <w:t>01</w:t>
+              <w:t>0</w:t>
+            </w:r>
+            <w:r>
+              <w:t>6</w:t>
             </w:r>
           </w:p>
         </w:tc>
@@ -6738,7 +6900,10 @@
           </w:tcPr>
           <w:p>
             <w:r>
-              <w:t>02</w:t>
+              <w:t>0</w:t>
+            </w:r>
+            <w:r>
+              <w:t>7</w:t>
             </w:r>
           </w:p>
         </w:tc>
@@ -6809,7 +6974,7 @@
               <w:t>0</w:t>
             </w:r>
             <w:r>
-              <w:t>3</w:t>
+              <w:t>8</w:t>
             </w:r>
           </w:p>
         </w:tc>
@@ -6820,7 +6985,15 @@
           </w:tcPr>
           <w:p>
             <w:r>
-              <w:t>Ordinary Differential Equation : Reference-1</w:t>
+              <w:t xml:space="preserve">Ordinary Differential </w:t>
+            </w:r>
+            <w:proofErr w:type="gramStart"/>
+            <w:r>
+              <w:t>Equation :</w:t>
+            </w:r>
+            <w:proofErr w:type="gramEnd"/>
+            <w:r>
+              <w:t xml:space="preserve"> Reference-1</w:t>
             </w:r>
           </w:p>
         </w:tc>
@@ -6884,7 +7057,15 @@
           </w:tcPr>
           <w:p>
             <w:r>
-              <w:t>Ordinary Differential Equation : Reference-1</w:t>
+              <w:t xml:space="preserve">Ordinary Differential </w:t>
+            </w:r>
+            <w:proofErr w:type="gramStart"/>
+            <w:r>
+              <w:t>Equation :</w:t>
+            </w:r>
+            <w:proofErr w:type="gramEnd"/>
+            <w:r>
+              <w:t xml:space="preserve"> Reference-1</w:t>
             </w:r>
           </w:p>
         </w:tc>
@@ -7057,8 +7238,19 @@
           <w:color w:val="C00000"/>
           <w:sz w:val="28"/>
         </w:rPr>
-        <w:t>Course Outcomes:-</w:t>
-      </w:r>
+        <w:t xml:space="preserve">Course </w:t>
+      </w:r>
+      <w:proofErr w:type="gramStart"/>
+      <w:r>
+        <w:rPr>
+          <w:b/>
+          <w:bCs/>
+          <w:color w:val="C00000"/>
+          <w:sz w:val="28"/>
+        </w:rPr>
+        <w:t>Outcomes:-</w:t>
+      </w:r>
+      <w:proofErr w:type="gramEnd"/>
     </w:p>
     <w:p>
       <w:pPr>
@@ -8167,7 +8359,10 @@
           </w:tcPr>
           <w:p>
             <w:r>
-              <w:t>01</w:t>
+              <w:t>0</w:t>
+            </w:r>
+            <w:r>
+              <w:t>6</w:t>
             </w:r>
           </w:p>
         </w:tc>
@@ -8235,7 +8430,10 @@
           </w:tcPr>
           <w:p>
             <w:r>
-              <w:t>02</w:t>
+              <w:t>0</w:t>
+            </w:r>
+            <w:r>
+              <w:t>7</w:t>
             </w:r>
           </w:p>
         </w:tc>
@@ -8306,7 +8504,7 @@
               <w:t>0</w:t>
             </w:r>
             <w:r>
-              <w:t>3</w:t>
+              <w:t>8</w:t>
             </w:r>
           </w:p>
         </w:tc>
@@ -8494,8 +8692,19 @@
           <w:color w:val="C00000"/>
           <w:sz w:val="28"/>
         </w:rPr>
-        <w:t>Course Outcomes:-</w:t>
-      </w:r>
+        <w:t xml:space="preserve">Course </w:t>
+      </w:r>
+      <w:proofErr w:type="gramStart"/>
+      <w:r>
+        <w:rPr>
+          <w:b/>
+          <w:bCs/>
+          <w:color w:val="C00000"/>
+          <w:sz w:val="28"/>
+        </w:rPr>
+        <w:t>Outcomes:-</w:t>
+      </w:r>
+      <w:proofErr w:type="gramEnd"/>
     </w:p>
     <w:p>
       <w:pPr>
@@ -9347,7 +9556,7 @@
               <w:t>0</w:t>
             </w:r>
             <w:r>
-              <w:t>1</w:t>
+              <w:t>6</w:t>
             </w:r>
           </w:p>
         </w:tc>
@@ -9418,7 +9627,7 @@
               <w:t>0</w:t>
             </w:r>
             <w:r>
-              <w:t>2</w:t>
+              <w:t>7</w:t>
             </w:r>
           </w:p>
         </w:tc>
@@ -9606,7 +9815,10 @@
           </w:tcPr>
           <w:p>
             <w:r>
-              <w:t>03</w:t>
+              <w:t>0</w:t>
+            </w:r>
+            <w:r>
+              <w:t>8</w:t>
             </w:r>
           </w:p>
         </w:tc>
@@ -9790,8 +10002,19 @@
           <w:color w:val="C00000"/>
           <w:sz w:val="28"/>
         </w:rPr>
-        <w:t>Course Outcomes:-</w:t>
-      </w:r>
+        <w:t xml:space="preserve">Course </w:t>
+      </w:r>
+      <w:proofErr w:type="gramStart"/>
+      <w:r>
+        <w:rPr>
+          <w:b/>
+          <w:bCs/>
+          <w:color w:val="C00000"/>
+          <w:sz w:val="28"/>
+        </w:rPr>
+        <w:t>Outcomes:-</w:t>
+      </w:r>
+      <w:proofErr w:type="gramEnd"/>
     </w:p>
     <w:p>
       <w:pPr>
@@ -10751,7 +10974,7 @@
               <w:t>0</w:t>
             </w:r>
             <w:r>
-              <w:t>1</w:t>
+              <w:t>6</w:t>
             </w:r>
           </w:p>
         </w:tc>
@@ -10814,7 +11037,7 @@
               <w:t>0</w:t>
             </w:r>
             <w:r>
-              <w:t>2</w:t>
+              <w:t>7</w:t>
             </w:r>
           </w:p>
         </w:tc>
@@ -10874,7 +11097,10 @@
           </w:tcPr>
           <w:p>
             <w:r>
-              <w:t>03</w:t>
+              <w:t>0</w:t>
+            </w:r>
+            <w:r>
+              <w:t>8</w:t>
             </w:r>
           </w:p>
         </w:tc>
@@ -11683,7 +11909,10 @@
               </w:rPr>
             </w:pPr>
             <w:r>
-              <w:t>01</w:t>
+              <w:t>0</w:t>
+            </w:r>
+            <w:r>
+              <w:t>6</w:t>
             </w:r>
           </w:p>
         </w:tc>
@@ -11742,7 +11971,7 @@
               <w:t>0</w:t>
             </w:r>
             <w:r>
-              <w:t>2</w:t>
+              <w:t>7</w:t>
             </w:r>
           </w:p>
         </w:tc>
@@ -11801,7 +12030,7 @@
               <w:t>0</w:t>
             </w:r>
             <w:r>
-              <w:t>3</w:t>
+              <w:t>8</w:t>
             </w:r>
           </w:p>
         </w:tc>
@@ -12602,7 +12831,10 @@
               </w:rPr>
             </w:pPr>
             <w:r>
-              <w:t>01</w:t>
+              <w:t>0</w:t>
+            </w:r>
+            <w:r>
+              <w:t>6</w:t>
             </w:r>
           </w:p>
         </w:tc>
@@ -12658,7 +12890,10 @@
           </w:tcPr>
           <w:p>
             <w:r>
-              <w:t>02</w:t>
+              <w:t>0</w:t>
+            </w:r>
+            <w:r>
+              <w:t>7</w:t>
             </w:r>
           </w:p>
         </w:tc>
@@ -12714,7 +12949,10 @@
           </w:tcPr>
           <w:p>
             <w:r>
-              <w:t>03</w:t>
+              <w:t>0</w:t>
+            </w:r>
+            <w:r>
+              <w:t>8</w:t>
             </w:r>
           </w:p>
         </w:tc>
@@ -13090,7 +13328,15 @@
           </w:tcPr>
           <w:p>
             <w:r>
-              <w:t>Physics – 2  (Thermal)</w:t>
+              <w:t xml:space="preserve">Physics – </w:t>
+            </w:r>
+            <w:proofErr w:type="gramStart"/>
+            <w:r>
+              <w:t>2  (</w:t>
+            </w:r>
+            <w:proofErr w:type="gramEnd"/>
+            <w:r>
+              <w:t>Thermal)</w:t>
             </w:r>
           </w:p>
         </w:tc>
@@ -13532,7 +13778,10 @@
               </w:rPr>
             </w:pPr>
             <w:r>
-              <w:t>01</w:t>
+              <w:t>0</w:t>
+            </w:r>
+            <w:r>
+              <w:t>6</w:t>
             </w:r>
           </w:p>
         </w:tc>
@@ -13588,7 +13837,10 @@
           </w:tcPr>
           <w:p>
             <w:r>
-              <w:t>02</w:t>
+              <w:t>0</w:t>
+            </w:r>
+            <w:r>
+              <w:t>7</w:t>
             </w:r>
           </w:p>
         </w:tc>
@@ -13644,7 +13896,10 @@
           </w:tcPr>
           <w:p>
             <w:r>
-              <w:t>03</w:t>
+              <w:t>0</w:t>
+            </w:r>
+            <w:r>
+              <w:t>8</w:t>
             </w:r>
           </w:p>
         </w:tc>
@@ -14517,7 +14772,15 @@
           </w:tcPr>
           <w:p>
             <w:r>
-              <w:t>API, Authentication (JWT|QAuth) and Advanced JavaScript</w:t>
+              <w:t>API, Authentication (</w:t>
+            </w:r>
+            <w:proofErr w:type="spellStart"/>
+            <w:r>
+              <w:t>JWT|QAuth</w:t>
+            </w:r>
+            <w:proofErr w:type="spellEnd"/>
+            <w:r>
+              <w:t>) and Advanced JavaScript</w:t>
             </w:r>
           </w:p>
         </w:tc>
@@ -14828,7 +15091,23 @@
           </w:tcPr>
           <w:p>
             <w:r>
-              <w:t xml:space="preserve">Test Framework (Cypress|Appium), Perofrmance Testing </w:t>
+              <w:t>Test Framework (</w:t>
+            </w:r>
+            <w:proofErr w:type="spellStart"/>
+            <w:r>
+              <w:t>Cypress|Appium</w:t>
+            </w:r>
+            <w:proofErr w:type="spellEnd"/>
+            <w:r>
+              <w:t xml:space="preserve">), </w:t>
+            </w:r>
+            <w:proofErr w:type="spellStart"/>
+            <w:r>
+              <w:t>Perofrmance</w:t>
+            </w:r>
+            <w:proofErr w:type="spellEnd"/>
+            <w:r>
+              <w:t xml:space="preserve"> Testing </w:t>
             </w:r>
           </w:p>
         </w:tc>
@@ -16677,8 +16956,13 @@
               </w:numPr>
               <w:ind w:left="211" w:hanging="240"/>
             </w:pPr>
-            <w:r>
-              <w:t xml:space="preserve">FreeCodeCamp Web Dev Guide </w:t>
+            <w:proofErr w:type="spellStart"/>
+            <w:r>
+              <w:t>FreeCodeCamp</w:t>
+            </w:r>
+            <w:proofErr w:type="spellEnd"/>
+            <w:r>
+              <w:t xml:space="preserve"> Web Dev Guide </w:t>
             </w:r>
           </w:p>
         </w:tc>
@@ -16900,7 +17184,15 @@
               <w:ind w:left="211" w:hanging="240"/>
             </w:pPr>
             <w:r>
-              <w:t xml:space="preserve">Frontend Mastery by Codecademy </w:t>
+              <w:t xml:space="preserve">Frontend Mastery by </w:t>
+            </w:r>
+            <w:proofErr w:type="spellStart"/>
+            <w:r>
+              <w:t>Codecademy</w:t>
+            </w:r>
+            <w:proofErr w:type="spellEnd"/>
+            <w:r>
+              <w:t xml:space="preserve"> </w:t>
             </w:r>
           </w:p>
         </w:tc>
@@ -17300,7 +17592,15 @@
               <w:ind w:left="211" w:hanging="240"/>
             </w:pPr>
             <w:r>
-              <w:t xml:space="preserve">Continuous Testing for DevOps Professionals by Katrina Clokie </w:t>
+              <w:t xml:space="preserve">Continuous Testing for DevOps Professionals by Katrina </w:t>
+            </w:r>
+            <w:proofErr w:type="spellStart"/>
+            <w:r>
+              <w:t>Clokie</w:t>
+            </w:r>
+            <w:proofErr w:type="spellEnd"/>
+            <w:r>
+              <w:t xml:space="preserve"> </w:t>
             </w:r>
           </w:p>
         </w:tc>
@@ -17630,7 +17930,23 @@
               <w:ind w:left="211" w:hanging="240"/>
             </w:pPr>
             <w:r>
-              <w:t xml:space="preserve">Mentorship Programs (linkedIn Learnig) </w:t>
+              <w:t>Mentorship Programs (</w:t>
+            </w:r>
+            <w:proofErr w:type="spellStart"/>
+            <w:r>
+              <w:t>linkedIn</w:t>
+            </w:r>
+            <w:proofErr w:type="spellEnd"/>
+            <w:r>
+              <w:t xml:space="preserve"> </w:t>
+            </w:r>
+            <w:proofErr w:type="spellStart"/>
+            <w:r>
+              <w:t>Learnig</w:t>
+            </w:r>
+            <w:proofErr w:type="spellEnd"/>
+            <w:r>
+              <w:t xml:space="preserve">) </w:t>
             </w:r>
           </w:p>
           <w:p>
@@ -19662,7 +19978,25 @@
                 <w:sz w:val="24"/>
                 <w:szCs w:val="24"/>
               </w:rPr>
-              <w:t>- Learn objects, arrays, and data structures - Asynchronous JavaScript (callbacks, promises, async/await) - Introduction to basic JavaScript libraries (e.g., Lodash)</w:t>
+              <w:t xml:space="preserve">- Learn objects, arrays, and data structures - Asynchronous JavaScript (callbacks, promises, async/await) - Introduction to basic JavaScript libraries (e.g., </w:t>
+            </w:r>
+            <w:proofErr w:type="spellStart"/>
+            <w:r>
+              <w:rPr>
+                <w:rFonts w:eastAsia="Times New Roman" w:cstheme="minorHAnsi"/>
+                <w:sz w:val="24"/>
+                <w:szCs w:val="24"/>
+              </w:rPr>
+              <w:t>Lodash</w:t>
+            </w:r>
+            <w:proofErr w:type="spellEnd"/>
+            <w:r>
+              <w:rPr>
+                <w:rFonts w:eastAsia="Times New Roman" w:cstheme="minorHAnsi"/>
+                <w:sz w:val="24"/>
+                <w:szCs w:val="24"/>
+              </w:rPr>
+              <w:t>)</w:t>
             </w:r>
           </w:p>
         </w:tc>
@@ -19687,8 +20021,36 @@
                 <w:sz w:val="24"/>
                 <w:szCs w:val="24"/>
               </w:rPr>
-              <w:t>- Build a simple interactive app (e.g., to-do list) - Complete JavaScript practice exercises on platforms like FreeCodeCamp or Codecademy</w:t>
-            </w:r>
+              <w:t xml:space="preserve">- Build a simple interactive app (e.g., to-do list) - Complete JavaScript practice exercises on platforms like </w:t>
+            </w:r>
+            <w:proofErr w:type="spellStart"/>
+            <w:r>
+              <w:rPr>
+                <w:rFonts w:eastAsia="Times New Roman" w:cstheme="minorHAnsi"/>
+                <w:sz w:val="24"/>
+                <w:szCs w:val="24"/>
+              </w:rPr>
+              <w:t>FreeCodeCamp</w:t>
+            </w:r>
+            <w:proofErr w:type="spellEnd"/>
+            <w:r>
+              <w:rPr>
+                <w:rFonts w:eastAsia="Times New Roman" w:cstheme="minorHAnsi"/>
+                <w:sz w:val="24"/>
+                <w:szCs w:val="24"/>
+              </w:rPr>
+              <w:t xml:space="preserve"> or </w:t>
+            </w:r>
+            <w:proofErr w:type="spellStart"/>
+            <w:r>
+              <w:rPr>
+                <w:rFonts w:eastAsia="Times New Roman" w:cstheme="minorHAnsi"/>
+                <w:sz w:val="24"/>
+                <w:szCs w:val="24"/>
+              </w:rPr>
+              <w:t>Codecademy</w:t>
+            </w:r>
+            <w:proofErr w:type="spellEnd"/>
           </w:p>
         </w:tc>
       </w:tr>
@@ -19771,7 +20133,25 @@
                 <w:sz w:val="24"/>
                 <w:szCs w:val="24"/>
               </w:rPr>
-              <w:t>- Learn ES6+ features (arrow functions, destructuring, modules) - Learn to use Web APIs (local storage, fetch API)</w:t>
+              <w:t xml:space="preserve">- Learn ES6+ features (arrow functions, </w:t>
+            </w:r>
+            <w:proofErr w:type="spellStart"/>
+            <w:r>
+              <w:rPr>
+                <w:rFonts w:eastAsia="Times New Roman" w:cstheme="minorHAnsi"/>
+                <w:sz w:val="24"/>
+                <w:szCs w:val="24"/>
+              </w:rPr>
+              <w:t>destructuring</w:t>
+            </w:r>
+            <w:proofErr w:type="spellEnd"/>
+            <w:r>
+              <w:rPr>
+                <w:rFonts w:eastAsia="Times New Roman" w:cstheme="minorHAnsi"/>
+                <w:sz w:val="24"/>
+                <w:szCs w:val="24"/>
+              </w:rPr>
+              <w:t>, modules) - Learn to use Web APIs (local storage, fetch API)</w:t>
             </w:r>
           </w:p>
         </w:tc>
@@ -19796,7 +20176,25 @@
                 <w:sz w:val="24"/>
                 <w:szCs w:val="24"/>
               </w:rPr>
-              <w:t>- Refactor existing projects with ES6+ features - Build a project that interacts with a Web API (e.g., weather app using OpenWeather API)</w:t>
+              <w:t xml:space="preserve">- Refactor existing projects with ES6+ features - Build a project that interacts with a Web API (e.g., weather app using </w:t>
+            </w:r>
+            <w:proofErr w:type="spellStart"/>
+            <w:r>
+              <w:rPr>
+                <w:rFonts w:eastAsia="Times New Roman" w:cstheme="minorHAnsi"/>
+                <w:sz w:val="24"/>
+                <w:szCs w:val="24"/>
+              </w:rPr>
+              <w:t>OpenWeather</w:t>
+            </w:r>
+            <w:proofErr w:type="spellEnd"/>
+            <w:r>
+              <w:rPr>
+                <w:rFonts w:eastAsia="Times New Roman" w:cstheme="minorHAnsi"/>
+                <w:sz w:val="24"/>
+                <w:szCs w:val="24"/>
+              </w:rPr>
+              <w:t xml:space="preserve"> API)</w:t>
             </w:r>
           </w:p>
         </w:tc>
@@ -21842,7 +22240,25 @@
           <w:sz w:val="24"/>
           <w:szCs w:val="24"/>
         </w:rPr>
-        <w:t>: Typically, students use an Integrated Development Environment (IDE) like Code::Blocks, Visual Studio, or any other relevant programming tools provided by the department.</w:t>
+        <w:t xml:space="preserve">: Typically, students use an Integrated Development Environment (IDE) like </w:t>
+      </w:r>
+      <w:proofErr w:type="gramStart"/>
+      <w:r>
+        <w:rPr>
+          <w:rFonts w:ascii="Times New Roman" w:eastAsia="Times New Roman" w:hAnsi="Times New Roman" w:cs="Times New Roman"/>
+          <w:sz w:val="24"/>
+          <w:szCs w:val="24"/>
+        </w:rPr>
+        <w:t>Code::</w:t>
+      </w:r>
+      <w:proofErr w:type="gramEnd"/>
+      <w:r>
+        <w:rPr>
+          <w:rFonts w:ascii="Times New Roman" w:eastAsia="Times New Roman" w:hAnsi="Times New Roman" w:cs="Times New Roman"/>
+          <w:sz w:val="24"/>
+          <w:szCs w:val="24"/>
+        </w:rPr>
+        <w:t>Blocks, Visual Studio, or any other relevant programming tools provided by the department.</w:t>
       </w:r>
     </w:p>
     <w:p>
@@ -28041,13 +28457,23 @@
               </w:rPr>
               <w:t xml:space="preserve"> statements, </w:t>
             </w:r>
+            <w:proofErr w:type="gramStart"/>
             <w:r>
               <w:rPr>
                 <w:rFonts w:ascii="Courier New" w:eastAsia="Times New Roman" w:hAnsi="Courier New" w:cs="Courier New"/>
                 <w:sz w:val="20"/>
                 <w:szCs w:val="20"/>
               </w:rPr>
-              <w:t>main()</w:t>
+              <w:t>main(</w:t>
+            </w:r>
+            <w:proofErr w:type="gramEnd"/>
+            <w:r>
+              <w:rPr>
+                <w:rFonts w:ascii="Courier New" w:eastAsia="Times New Roman" w:hAnsi="Courier New" w:cs="Courier New"/>
+                <w:sz w:val="20"/>
+                <w:szCs w:val="20"/>
+              </w:rPr>
+              <w:t>)</w:t>
             </w:r>
             <w:r>
               <w:rPr>
@@ -28292,29 +28718,69 @@
               </w:rPr>
               <w:t xml:space="preserve">Introduction to basic input/output functions in C such as </w:t>
             </w:r>
+            <w:proofErr w:type="spellStart"/>
+            <w:proofErr w:type="gramStart"/>
             <w:r>
               <w:rPr>
                 <w:rFonts w:ascii="Courier New" w:eastAsia="Times New Roman" w:hAnsi="Courier New" w:cs="Courier New"/>
                 <w:sz w:val="20"/>
                 <w:szCs w:val="20"/>
               </w:rPr>
-              <w:t>printf()</w:t>
-            </w:r>
-            <w:r>
-              <w:rPr>
-                <w:rFonts w:ascii="Times New Roman" w:eastAsia="Times New Roman" w:hAnsi="Times New Roman" w:cs="Times New Roman"/>
-                <w:sz w:val="24"/>
-                <w:szCs w:val="24"/>
-              </w:rPr>
-              <w:t xml:space="preserve">, </w:t>
-            </w:r>
+              <w:t>printf</w:t>
+            </w:r>
+            <w:proofErr w:type="spellEnd"/>
             <w:r>
               <w:rPr>
                 <w:rFonts w:ascii="Courier New" w:eastAsia="Times New Roman" w:hAnsi="Courier New" w:cs="Courier New"/>
                 <w:sz w:val="20"/>
                 <w:szCs w:val="20"/>
               </w:rPr>
-              <w:t>scanf()</w:t>
+              <w:t>(</w:t>
+            </w:r>
+            <w:proofErr w:type="gramEnd"/>
+            <w:r>
+              <w:rPr>
+                <w:rFonts w:ascii="Courier New" w:eastAsia="Times New Roman" w:hAnsi="Courier New" w:cs="Courier New"/>
+                <w:sz w:val="20"/>
+                <w:szCs w:val="20"/>
+              </w:rPr>
+              <w:t>)</w:t>
+            </w:r>
+            <w:r>
+              <w:rPr>
+                <w:rFonts w:ascii="Times New Roman" w:eastAsia="Times New Roman" w:hAnsi="Times New Roman" w:cs="Times New Roman"/>
+                <w:sz w:val="24"/>
+                <w:szCs w:val="24"/>
+              </w:rPr>
+              <w:t xml:space="preserve">, </w:t>
+            </w:r>
+            <w:proofErr w:type="spellStart"/>
+            <w:proofErr w:type="gramStart"/>
+            <w:r>
+              <w:rPr>
+                <w:rFonts w:ascii="Courier New" w:eastAsia="Times New Roman" w:hAnsi="Courier New" w:cs="Courier New"/>
+                <w:sz w:val="20"/>
+                <w:szCs w:val="20"/>
+              </w:rPr>
+              <w:t>scanf</w:t>
+            </w:r>
+            <w:proofErr w:type="spellEnd"/>
+            <w:r>
+              <w:rPr>
+                <w:rFonts w:ascii="Courier New" w:eastAsia="Times New Roman" w:hAnsi="Courier New" w:cs="Courier New"/>
+                <w:sz w:val="20"/>
+                <w:szCs w:val="20"/>
+              </w:rPr>
+              <w:t>(</w:t>
+            </w:r>
+            <w:proofErr w:type="gramEnd"/>
+            <w:r>
+              <w:rPr>
+                <w:rFonts w:ascii="Courier New" w:eastAsia="Times New Roman" w:hAnsi="Courier New" w:cs="Courier New"/>
+                <w:sz w:val="20"/>
+                <w:szCs w:val="20"/>
+              </w:rPr>
+              <w:t>)</w:t>
             </w:r>
             <w:r>
               <w:rPr>
@@ -28543,13 +29009,23 @@
               </w:rPr>
               <w:t xml:space="preserve">Discussion on how the program flows from top to bottom, the role of the </w:t>
             </w:r>
+            <w:proofErr w:type="gramStart"/>
             <w:r>
               <w:rPr>
                 <w:rFonts w:ascii="Courier New" w:eastAsia="Times New Roman" w:hAnsi="Courier New" w:cs="Courier New"/>
                 <w:sz w:val="20"/>
                 <w:szCs w:val="20"/>
               </w:rPr>
-              <w:t>main()</w:t>
+              <w:t>main(</w:t>
+            </w:r>
+            <w:proofErr w:type="gramEnd"/>
+            <w:r>
+              <w:rPr>
+                <w:rFonts w:ascii="Courier New" w:eastAsia="Times New Roman" w:hAnsi="Courier New" w:cs="Courier New"/>
+                <w:sz w:val="20"/>
+                <w:szCs w:val="20"/>
+              </w:rPr>
+              <w:t>)</w:t>
             </w:r>
             <w:r>
               <w:rPr>
@@ -29110,6 +29586,7 @@
               </w:rPr>
               <w:t xml:space="preserve">Explanation of </w:t>
             </w:r>
+            <w:proofErr w:type="spellStart"/>
             <w:r>
               <w:rPr>
                 <w:rFonts w:ascii="Courier New" w:eastAsia="Times New Roman" w:hAnsi="Courier New" w:cs="Courier New"/>
@@ -29118,6 +29595,7 @@
               </w:rPr>
               <w:t>if</w:t>
             </w:r>
+            <w:proofErr w:type="spellEnd"/>
             <w:r>
               <w:rPr>
                 <w:rFonts w:ascii="Times New Roman" w:eastAsia="Times New Roman" w:hAnsi="Times New Roman" w:cs="Times New Roman"/>
@@ -29207,6 +29685,7 @@
               </w:rPr>
               <w:t>==</w:t>
             </w:r>
+            <w:proofErr w:type="gramStart"/>
             <w:r>
               <w:rPr>
                 <w:rFonts w:ascii="Times New Roman" w:eastAsia="Times New Roman" w:hAnsi="Times New Roman" w:cs="Times New Roman"/>
@@ -29221,7 +29700,16 @@
                 <w:sz w:val="20"/>
                 <w:szCs w:val="20"/>
               </w:rPr>
-              <w:t>!=</w:t>
+              <w:t>!</w:t>
+            </w:r>
+            <w:proofErr w:type="gramEnd"/>
+            <w:r>
+              <w:rPr>
+                <w:rFonts w:ascii="Courier New" w:eastAsia="Times New Roman" w:hAnsi="Courier New" w:cs="Courier New"/>
+                <w:sz w:val="20"/>
+                <w:szCs w:val="20"/>
+              </w:rPr>
+              <w:t>=</w:t>
             </w:r>
             <w:r>
               <w:rPr>
@@ -31179,15 +31667,43 @@
                 <w:sz w:val="20"/>
                 <w:szCs w:val="20"/>
               </w:rPr>
-              <w:t>int arr[5];</w:t>
-            </w:r>
-            <w:r>
-              <w:rPr>
-                <w:rFonts w:ascii="Times New Roman" w:eastAsia="Times New Roman" w:hAnsi="Times New Roman" w:cs="Times New Roman"/>
-                <w:sz w:val="24"/>
-                <w:szCs w:val="24"/>
-              </w:rPr>
-              <w:t>) and initializing at the time of declaration.</w:t>
+              <w:t xml:space="preserve">int </w:t>
+            </w:r>
+            <w:proofErr w:type="spellStart"/>
+            <w:proofErr w:type="gramStart"/>
+            <w:r>
+              <w:rPr>
+                <w:rFonts w:ascii="Courier New" w:eastAsia="Times New Roman" w:hAnsi="Courier New" w:cs="Courier New"/>
+                <w:sz w:val="20"/>
+                <w:szCs w:val="20"/>
+              </w:rPr>
+              <w:t>arr</w:t>
+            </w:r>
+            <w:proofErr w:type="spellEnd"/>
+            <w:r>
+              <w:rPr>
+                <w:rFonts w:ascii="Courier New" w:eastAsia="Times New Roman" w:hAnsi="Courier New" w:cs="Courier New"/>
+                <w:sz w:val="20"/>
+                <w:szCs w:val="20"/>
+              </w:rPr>
+              <w:t>[5];</w:t>
+            </w:r>
+            <w:r>
+              <w:rPr>
+                <w:rFonts w:ascii="Times New Roman" w:eastAsia="Times New Roman" w:hAnsi="Times New Roman" w:cs="Times New Roman"/>
+                <w:sz w:val="24"/>
+                <w:szCs w:val="24"/>
+              </w:rPr>
+              <w:t>)</w:t>
+            </w:r>
+            <w:proofErr w:type="gramEnd"/>
+            <w:r>
+              <w:rPr>
+                <w:rFonts w:ascii="Times New Roman" w:eastAsia="Times New Roman" w:hAnsi="Times New Roman" w:cs="Times New Roman"/>
+                <w:sz w:val="24"/>
+                <w:szCs w:val="24"/>
+              </w:rPr>
+              <w:t xml:space="preserve"> and initializing at the time of declaration.</w:t>
             </w:r>
           </w:p>
         </w:tc>
@@ -31303,13 +31819,33 @@
               </w:rPr>
               <w:t xml:space="preserve">Introduction to multidimensional arrays (e.g., 2D arrays). Explanation of how to declare, initialize, and access elements in a 2D array (e.g., </w:t>
             </w:r>
+            <w:proofErr w:type="spellStart"/>
+            <w:proofErr w:type="gramStart"/>
             <w:r>
               <w:rPr>
                 <w:rFonts w:ascii="Courier New" w:eastAsia="Times New Roman" w:hAnsi="Courier New" w:cs="Courier New"/>
                 <w:sz w:val="20"/>
                 <w:szCs w:val="20"/>
               </w:rPr>
-              <w:t>arr[2][3]</w:t>
+              <w:t>arr</w:t>
+            </w:r>
+            <w:proofErr w:type="spellEnd"/>
+            <w:r>
+              <w:rPr>
+                <w:rFonts w:ascii="Courier New" w:eastAsia="Times New Roman" w:hAnsi="Courier New" w:cs="Courier New"/>
+                <w:sz w:val="20"/>
+                <w:szCs w:val="20"/>
+              </w:rPr>
+              <w:t>[</w:t>
+            </w:r>
+            <w:proofErr w:type="gramEnd"/>
+            <w:r>
+              <w:rPr>
+                <w:rFonts w:ascii="Courier New" w:eastAsia="Times New Roman" w:hAnsi="Courier New" w:cs="Courier New"/>
+                <w:sz w:val="20"/>
+                <w:szCs w:val="20"/>
+              </w:rPr>
+              <w:t>2][3]</w:t>
             </w:r>
             <w:r>
               <w:rPr>

</xml_diff>

<commit_message>
personal library (ver-2) update-159
</commit_message>
<xml_diff>
--- a/resources/Courses/GPT/Courses.docx
+++ b/resources/Courses/GPT/Courses.docx
@@ -6842,6 +6842,12 @@
             <w:r>
               <w:t>Software Quality Assurance</w:t>
             </w:r>
+            <w:r>
+              <w:t xml:space="preserve"> &amp; </w:t>
+            </w:r>
+            <w:r>
+              <w:t>Maintenance</w:t>
+            </w:r>
           </w:p>
         </w:tc>
         <w:tc>
@@ -6864,6 +6870,12 @@
             <w:r>
               <w:t>26</w:t>
             </w:r>
+            <w:r>
+              <w:t>+</w:t>
+            </w:r>
+            <w:r>
+              <w:t>16</w:t>
+            </w:r>
           </w:p>
         </w:tc>
         <w:tc>
@@ -6878,6 +6890,12 @@
             <w:r>
               <w:t>9</w:t>
             </w:r>
+            <w:r>
+              <w:t>+</w:t>
+            </w:r>
+            <w:r>
+              <w:t>160</w:t>
+            </w:r>
           </w:p>
         </w:tc>
         <w:tc>
@@ -6888,6 +6906,12 @@
           <w:p>
             <w:r>
               <w:t>617</w:t>
+            </w:r>
+            <w:r>
+              <w:t>+</w:t>
+            </w:r>
+            <w:r>
+              <w:t>420</w:t>
             </w:r>
           </w:p>
         </w:tc>
@@ -6900,81 +6924,7 @@
           </w:tcPr>
           <w:p>
             <w:r>
-              <w:t>0</w:t>
-            </w:r>
-            <w:r>
-              <w:t>7</w:t>
-            </w:r>
-          </w:p>
-        </w:tc>
-        <w:tc>
-          <w:tcPr>
-            <w:tcW w:w="2369" w:type="pct"/>
-            <w:shd w:val="clear" w:color="auto" w:fill="E7E6E6" w:themeFill="background2"/>
-          </w:tcPr>
-          <w:p>
-            <w:r>
-              <w:t>Software Maintenance</w:t>
-            </w:r>
-          </w:p>
-        </w:tc>
-        <w:tc>
-          <w:tcPr>
-            <w:tcW w:w="735" w:type="pct"/>
-            <w:shd w:val="clear" w:color="auto" w:fill="E7E6E6" w:themeFill="background2"/>
-          </w:tcPr>
-          <w:p>
-            <w:r>
-              <w:t>T-H3 + S-H2</w:t>
-            </w:r>
-          </w:p>
-        </w:tc>
-        <w:tc>
-          <w:tcPr>
-            <w:tcW w:w="371" w:type="pct"/>
-            <w:shd w:val="clear" w:color="auto" w:fill="E7E6E6" w:themeFill="background2"/>
-          </w:tcPr>
-          <w:p>
-            <w:r>
-              <w:t>16</w:t>
-            </w:r>
-          </w:p>
-        </w:tc>
-        <w:tc>
-          <w:tcPr>
-            <w:tcW w:w="559" w:type="pct"/>
-            <w:shd w:val="clear" w:color="auto" w:fill="E7E6E6" w:themeFill="background2"/>
-          </w:tcPr>
-          <w:p>
-            <w:r>
-              <w:t>160</w:t>
-            </w:r>
-          </w:p>
-        </w:tc>
-        <w:tc>
-          <w:tcPr>
-            <w:tcW w:w="444" w:type="pct"/>
-            <w:shd w:val="clear" w:color="auto" w:fill="E7E6E6" w:themeFill="background2"/>
-          </w:tcPr>
-          <w:p>
-            <w:r>
-              <w:t>420</w:t>
-            </w:r>
-          </w:p>
-        </w:tc>
-      </w:tr>
-      <w:tr>
-        <w:tc>
-          <w:tcPr>
-            <w:tcW w:w="522" w:type="pct"/>
-            <w:shd w:val="clear" w:color="auto" w:fill="E7E6E6" w:themeFill="background2"/>
-          </w:tcPr>
-          <w:p>
-            <w:r>
-              <w:t>0</w:t>
-            </w:r>
-            <w:r>
-              <w:t>8</w:t>
+              <w:t>07</w:t>
             </w:r>
           </w:p>
         </w:tc>

</xml_diff>